<commit_message>
Remove budget sections from research proposal
Drops the request/dollar amounts box, the budget card, and the "and budget"
heading text; layout and all other content unchanged (still 3 pages).

Co-Authored-By: Claude <noreply@anthropic.com>
Claude-Session: https://claude.ai/code/session_01H6VUBEbYGeyGhNeedRUQ12
</commit_message>
<xml_diff>
--- a/Research_Proposal_Test_Before_You_Treat.docx
+++ b/Research_Proposal_Test_Before_You_Treat.docx
@@ -90,10 +90,9 @@
         <w:tblLayout w:type="fixed"/>
       </w:tblPr>
       <w:tblGrid>
-        <w:gridCol w:w="3500"/>
-        <w:gridCol w:w="3500"/>
-        <w:gridCol w:w="1700"/>
-        <w:gridCol w:w="2100"/>
+        <w:gridCol w:w="4300"/>
+        <w:gridCol w:w="4300"/>
+        <w:gridCol w:w="2200"/>
       </w:tblGrid>
       <w:tr>
         <w:trPr>
@@ -101,7 +100,7 @@
         </w:trPr>
         <w:tc>
           <w:tcPr>
-            <w:tcW w:type="dxa" w:w="3500"/>
+            <w:tcW w:type="dxa" w:w="4300"/>
             <w:tcBorders>
               <w:top w:val="single" w:color="14324F" w:sz="24"/>
               <w:left w:val="none" w:color="FFFFFF" w:sz="0"/>
@@ -162,7 +161,7 @@
         </w:tc>
         <w:tc>
           <w:tcPr>
-            <w:tcW w:type="dxa" w:w="3500"/>
+            <w:tcW w:type="dxa" w:w="4300"/>
             <w:tcBorders>
               <w:top w:val="single" w:color="17707E" w:sz="24"/>
               <w:left w:val="single" w:color="FFFFFF" w:sz="24"/>
@@ -223,12 +222,12 @@
         </w:tc>
         <w:tc>
           <w:tcPr>
-            <w:tcW w:type="dxa" w:w="1700"/>
+            <w:tcW w:type="dxa" w:w="2200"/>
             <w:tcBorders>
               <w:top w:val="single" w:color="A85A14" w:sz="24"/>
               <w:left w:val="single" w:color="FFFFFF" w:sz="24"/>
               <w:bottom w:val="none" w:color="FFFFFF" w:sz="0"/>
-              <w:right w:val="single" w:color="FFFFFF" w:sz="24"/>
+              <w:right w:val="none" w:color="FFFFFF" w:sz="0"/>
             </w:tcBorders>
             <w:shd w:fill="F4F6F8" w:color="auto" w:val="clear"/>
             <w:tcMar>
@@ -267,68 +266,6 @@
                 <w:szCs w:val="26"/>
               </w:rPr>
               <w:t xml:space="preserve">12 months</w:t>
-            </w:r>
-          </w:p>
-        </w:tc>
-        <w:tc>
-          <w:tcPr>
-            <w:tcW w:type="dxa" w:w="2100"/>
-            <w:tcBorders>
-              <w:top w:val="single" w:color="A85A14" w:sz="24"/>
-              <w:left w:val="single" w:color="FFFFFF" w:sz="24"/>
-              <w:bottom w:val="none" w:color="FFFFFF" w:sz="0"/>
-              <w:right w:val="none" w:color="FFFFFF" w:sz="0"/>
-            </w:tcBorders>
-            <w:shd w:fill="F4F6F8" w:color="auto" w:val="clear"/>
-            <w:tcMar>
-              <w:top w:type="dxa" w:w="60"/>
-              <w:left w:type="dxa" w:w="110"/>
-              <w:bottom w:type="dxa" w:w="60"/>
-              <w:right w:type="dxa" w:w="110"/>
-            </w:tcMar>
-          </w:tcPr>
-          <w:p>
-            <w:pPr>
-              <w:spacing w:after="10" w:before="0" w:line="220" w:lineRule="auto"/>
-            </w:pPr>
-            <w:r>
-              <w:rPr>
-                <w:b/>
-                <w:bCs/>
-                <w:color w:val="A85A14"/>
-                <w:spacing w:val="16"/>
-                <w:sz w:val="14"/>
-                <w:szCs w:val="14"/>
-              </w:rPr>
-              <w:t xml:space="preserve">REQUEST</w:t>
-            </w:r>
-          </w:p>
-          <w:p>
-            <w:pPr>
-              <w:spacing w:after="0" w:before="0" w:line="240" w:lineRule="auto"/>
-            </w:pPr>
-            <w:r>
-              <w:rPr>
-                <w:b/>
-                <w:bCs/>
-                <w:color w:val="14324F"/>
-                <w:sz w:val="26"/>
-                <w:szCs w:val="26"/>
-              </w:rPr>
-              <w:t xml:space="preserve">$75,000</w:t>
-            </w:r>
-          </w:p>
-          <w:p>
-            <w:pPr>
-              <w:spacing w:after="0" w:before="0" w:line="225" w:lineRule="auto"/>
-            </w:pPr>
-            <w:r>
-              <w:rPr>
-                <w:color w:val="52606D"/>
-                <w:sz w:val="15"/>
-                <w:szCs w:val="15"/>
-              </w:rPr>
-              <w:t xml:space="preserve">$50,000 Utah · $25,000 UNC</w:t>
             </w:r>
           </w:p>
         </w:tc>
@@ -1421,7 +1358,7 @@
         </w:tc>
         <w:tc>
           <w:tcPr>
-            <w:tcW w:type="dxa" w:w="150"/>
+            <w:tcW w:type="dxa" w:w="200"/>
             <w:tcBorders>
               <w:top w:val="none" w:color="FFFFFF" w:sz="0"/>
               <w:left w:val="none" w:color="FFFFFF" w:sz="0"/>
@@ -1592,7 +1529,7 @@
         </w:tc>
         <w:tc>
           <w:tcPr>
-            <w:tcW w:type="dxa" w:w="150"/>
+            <w:tcW w:type="dxa" w:w="200"/>
             <w:tcBorders>
               <w:top w:val="none" w:color="FFFFFF" w:sz="0"/>
               <w:left w:val="none" w:color="FFFFFF" w:sz="0"/>
@@ -5459,7 +5396,7 @@
         <w:pStyle w:val="Heading1"/>
       </w:pPr>
       <w:r>
-        <w:t xml:space="preserve">Team and budget</w:t>
+        <w:t xml:space="preserve">Team</w:t>
       </w:r>
     </w:p>
     <w:tbl>
@@ -5476,11 +5413,9 @@
         <w:tblLayout w:type="fixed"/>
       </w:tblPr>
       <w:tblGrid>
-        <w:gridCol w:w="3500"/>
-        <w:gridCol w:w="150"/>
-        <w:gridCol w:w="3500"/>
-        <w:gridCol w:w="150"/>
-        <w:gridCol w:w="3500"/>
+        <w:gridCol w:w="5300"/>
+        <w:gridCol w:w="200"/>
+        <w:gridCol w:w="5300"/>
       </w:tblGrid>
       <w:tr>
         <w:trPr>
@@ -5488,7 +5423,7 @@
         </w:trPr>
         <w:tc>
           <w:tcPr>
-            <w:tcW w:type="dxa" w:w="3500"/>
+            <w:tcW w:type="dxa" w:w="5300"/>
             <w:tcBorders>
               <w:top w:val="none" w:color="FFFFFF" w:sz="0"/>
               <w:left w:val="none" w:color="FFFFFF" w:sz="0"/>
@@ -5522,7 +5457,7 @@
         </w:tc>
         <w:tc>
           <w:tcPr>
-            <w:tcW w:type="dxa" w:w="150"/>
+            <w:tcW w:type="dxa" w:w="200"/>
             <w:tcBorders>
               <w:top w:val="none" w:color="FFFFFF" w:sz="0"/>
               <w:left w:val="none" w:color="FFFFFF" w:sz="0"/>
@@ -5540,7 +5475,7 @@
         </w:tc>
         <w:tc>
           <w:tcPr>
-            <w:tcW w:type="dxa" w:w="3500"/>
+            <w:tcW w:type="dxa" w:w="5300"/>
             <w:tcBorders>
               <w:top w:val="none" w:color="FFFFFF" w:sz="0"/>
               <w:left w:val="none" w:color="FFFFFF" w:sz="0"/>
@@ -5569,58 +5504,6 @@
                 <w:szCs w:val="20"/>
               </w:rPr>
               <w:t xml:space="preserve">UNC · Dr. Andrew Satterlee</w:t>
-            </w:r>
-          </w:p>
-        </w:tc>
-        <w:tc>
-          <w:tcPr>
-            <w:tcW w:type="dxa" w:w="150"/>
-            <w:tcBorders>
-              <w:top w:val="none" w:color="FFFFFF" w:sz="0"/>
-              <w:left w:val="none" w:color="FFFFFF" w:sz="0"/>
-              <w:bottom w:val="none" w:color="FFFFFF" w:sz="0"/>
-              <w:right w:val="none" w:color="FFFFFF" w:sz="0"/>
-            </w:tcBorders>
-            <w:tcMar>
-              <w:top w:type="dxa" w:w="60"/>
-              <w:left w:type="dxa" w:w="110"/>
-              <w:bottom w:type="dxa" w:w="60"/>
-              <w:right w:type="dxa" w:w="110"/>
-            </w:tcMar>
-          </w:tcPr>
-          <w:p/>
-        </w:tc>
-        <w:tc>
-          <w:tcPr>
-            <w:tcW w:type="dxa" w:w="3500"/>
-            <w:tcBorders>
-              <w:top w:val="none" w:color="FFFFFF" w:sz="0"/>
-              <w:left w:val="none" w:color="FFFFFF" w:sz="0"/>
-              <w:bottom w:val="none" w:color="FFFFFF" w:sz="0"/>
-              <w:right w:val="none" w:color="FFFFFF" w:sz="0"/>
-            </w:tcBorders>
-            <w:shd w:fill="A85A14" w:color="auto" w:val="clear"/>
-            <w:tcMar>
-              <w:top w:type="dxa" w:w="55"/>
-              <w:left w:type="dxa" w:w="120"/>
-              <w:bottom w:type="dxa" w:w="55"/>
-              <w:right w:type="dxa" w:w="120"/>
-            </w:tcMar>
-          </w:tcPr>
-          <w:p>
-            <w:pPr>
-              <w:keepNext/>
-              <w:spacing w:after="0" w:before="0" w:line="240" w:lineRule="auto"/>
-            </w:pPr>
-            <w:r>
-              <w:rPr>
-                <w:b/>
-                <w:bCs/>
-                <w:color w:val="FFFFFF"/>
-                <w:sz w:val="20"/>
-                <w:szCs w:val="20"/>
-              </w:rPr>
-              <w:t xml:space="preserve">Budget · $75,000 over 12 months</w:t>
             </w:r>
           </w:p>
         </w:tc>
@@ -5631,7 +5514,7 @@
         </w:trPr>
         <w:tc>
           <w:tcPr>
-            <w:tcW w:type="dxa" w:w="3500"/>
+            <w:tcW w:type="dxa" w:w="5300"/>
             <w:tcBorders>
               <w:top w:val="none" w:color="FFFFFF" w:sz="0"/>
               <w:left w:val="none" w:color="FFFFFF" w:sz="0"/>
@@ -5722,7 +5605,7 @@
         </w:tc>
         <w:tc>
           <w:tcPr>
-            <w:tcW w:type="dxa" w:w="150"/>
+            <w:tcW w:type="dxa" w:w="200"/>
             <w:tcBorders>
               <w:top w:val="none" w:color="FFFFFF" w:sz="0"/>
               <w:left w:val="none" w:color="FFFFFF" w:sz="0"/>
@@ -5740,7 +5623,7 @@
         </w:tc>
         <w:tc>
           <w:tcPr>
-            <w:tcW w:type="dxa" w:w="3500"/>
+            <w:tcW w:type="dxa" w:w="5300"/>
             <w:tcBorders>
               <w:top w:val="none" w:color="FFFFFF" w:sz="0"/>
               <w:left w:val="none" w:color="FFFFFF" w:sz="0"/>
@@ -5796,96 +5679,6 @@
                 <w:szCs w:val="18"/>
               </w:rPr>
               <w:t xml:space="preserve"> receiving shipments, SLiCE testing and the normal-brain safety readout.</w:t>
-            </w:r>
-          </w:p>
-        </w:tc>
-        <w:tc>
-          <w:tcPr>
-            <w:tcW w:type="dxa" w:w="150"/>
-            <w:tcBorders>
-              <w:top w:val="none" w:color="FFFFFF" w:sz="0"/>
-              <w:left w:val="none" w:color="FFFFFF" w:sz="0"/>
-              <w:bottom w:val="none" w:color="FFFFFF" w:sz="0"/>
-              <w:right w:val="none" w:color="FFFFFF" w:sz="0"/>
-            </w:tcBorders>
-            <w:tcMar>
-              <w:top w:type="dxa" w:w="60"/>
-              <w:left w:type="dxa" w:w="110"/>
-              <w:bottom w:type="dxa" w:w="60"/>
-              <w:right w:type="dxa" w:w="110"/>
-            </w:tcMar>
-          </w:tcPr>
-          <w:p/>
-        </w:tc>
-        <w:tc>
-          <w:tcPr>
-            <w:tcW w:type="dxa" w:w="3500"/>
-            <w:tcBorders>
-              <w:top w:val="none" w:color="FFFFFF" w:sz="0"/>
-              <w:left w:val="none" w:color="FFFFFF" w:sz="0"/>
-              <w:bottom w:val="none" w:color="FFFFFF" w:sz="0"/>
-              <w:right w:val="none" w:color="FFFFFF" w:sz="0"/>
-            </w:tcBorders>
-            <w:shd w:fill="FCEFDD" w:color="auto" w:val="clear"/>
-            <w:tcMar>
-              <w:top w:type="dxa" w:w="70"/>
-              <w:left w:type="dxa" w:w="120"/>
-              <w:bottom w:type="dxa" w:w="70"/>
-              <w:right w:type="dxa" w:w="120"/>
-            </w:tcMar>
-          </w:tcPr>
-          <w:p>
-            <w:pPr>
-              <w:spacing w:after="40" w:before="0" w:line="240" w:lineRule="auto"/>
-            </w:pPr>
-            <w:r>
-              <w:rPr>
-                <w:b/>
-                <w:bCs/>
-                <w:sz w:val="18"/>
-                <w:szCs w:val="18"/>
-              </w:rPr>
-              <w:t xml:space="preserve">$50,000</w:t>
-            </w:r>
-            <w:r>
-              <w:rPr>
-                <w:sz w:val="18"/>
-                <w:szCs w:val="18"/>
-              </w:rPr>
-              <w:t xml:space="preserve"> to Dr. Cheshier’s laboratory for cell production, freezing, engineering and shipping.</w:t>
-            </w:r>
-          </w:p>
-          <w:p>
-            <w:pPr>
-              <w:spacing w:after="40" w:before="0" w:line="240" w:lineRule="auto"/>
-            </w:pPr>
-            <w:r>
-              <w:rPr>
-                <w:b/>
-                <w:bCs/>
-                <w:sz w:val="18"/>
-                <w:szCs w:val="18"/>
-              </w:rPr>
-              <w:t xml:space="preserve">$25,000</w:t>
-            </w:r>
-            <w:r>
-              <w:rPr>
-                <w:sz w:val="18"/>
-                <w:szCs w:val="18"/>
-              </w:rPr>
-              <w:t xml:space="preserve"> to Dr. Satterlee’s laboratory for SLiCE testing.</w:t>
-            </w:r>
-          </w:p>
-          <w:p>
-            <w:pPr>
-              <w:spacing w:after="40" w:before="0" w:line="240" w:lineRule="auto"/>
-            </w:pPr>
-            <w:r>
-              <w:rPr>
-                <w:sz w:val="18"/>
-                <w:szCs w:val="18"/>
-              </w:rPr>
-              <w:t xml:space="preserve">Line items are in the separate budget document.</w:t>
             </w:r>
           </w:p>
         </w:tc>

</xml_diff>